<commit_message>
feat: update all visualizations, models, benchmarks, and reports with 1M dataset results
</commit_message>
<xml_diff>
--- a/Laboratory_Record_CSE4192.docx
+++ b/Laboratory_Record_CSE4192.docx
@@ -6101,7 +6101,7 @@
       <w:r>
         <w:drawing>
           <wp:inline xmlns:a="http://schemas.openxmlformats.org/drawingml/2006/main" xmlns:pic="http://schemas.openxmlformats.org/drawingml/2006/picture">
-            <wp:extent cx="4206240" cy="1502229"/>
+            <wp:extent cx="4206240" cy="1733438"/>
             <wp:docPr id="7" name="Picture 7"/>
             <wp:cNvGraphicFramePr>
               <a:graphicFrameLocks noChangeAspect="1"/>
@@ -6122,7 +6122,7 @@
                   <pic:spPr>
                     <a:xfrm>
                       <a:off x="0" y="0"/>
-                      <a:ext cx="4206240" cy="1502229"/>
+                      <a:ext cx="4206240" cy="1733438"/>
                     </a:xfrm>
                     <a:prstGeom prst="rect"/>
                   </pic:spPr>
@@ -6378,7 +6378,7 @@
               <w:rPr>
                 <w:sz w:val="17"/>
               </w:rPr>
-              <w:t>0.12 s</w:t>
+              <w:t>3.32 s</w:t>
             </w:r>
           </w:p>
         </w:tc>
@@ -6397,7 +6397,7 @@
               <w:rPr>
                 <w:sz w:val="17"/>
               </w:rPr>
-              <w:t>$1.974</w:t>
+              <w:t>$1.990</w:t>
             </w:r>
           </w:p>
         </w:tc>
@@ -6416,7 +6416,7 @@
               <w:rPr>
                 <w:sz w:val="17"/>
               </w:rPr>
-              <w:t>15.735</w:t>
+              <w:t>13.470</w:t>
             </w:r>
           </w:p>
         </w:tc>
@@ -6435,7 +6435,7 @@
               <w:rPr>
                 <w:sz w:val="17"/>
               </w:rPr>
-              <w:t>$3.967</w:t>
+              <w:t>$3.670</w:t>
             </w:r>
           </w:p>
         </w:tc>
@@ -6454,7 +6454,7 @@
               <w:rPr>
                 <w:sz w:val="17"/>
               </w:rPr>
-              <w:t>0.8245</w:t>
+              <w:t>0.8441</w:t>
             </w:r>
           </w:p>
         </w:tc>
@@ -6494,7 +6494,7 @@
               <w:rPr>
                 <w:sz w:val="17"/>
               </w:rPr>
-              <w:t>0.03 s</w:t>
+              <w:t>0.58 s</w:t>
             </w:r>
           </w:p>
         </w:tc>
@@ -6513,7 +6513,7 @@
               <w:rPr>
                 <w:sz w:val="17"/>
               </w:rPr>
-              <w:t>$1.979</w:t>
+              <w:t>$1.990</w:t>
             </w:r>
           </w:p>
         </w:tc>
@@ -6532,7 +6532,7 @@
               <w:rPr>
                 <w:sz w:val="17"/>
               </w:rPr>
-              <w:t>15.742</w:t>
+              <w:t>13.470</w:t>
             </w:r>
           </w:p>
         </w:tc>
@@ -6551,7 +6551,7 @@
               <w:rPr>
                 <w:sz w:val="17"/>
               </w:rPr>
-              <w:t>$3.968</w:t>
+              <w:t>$3.670</w:t>
             </w:r>
           </w:p>
         </w:tc>
@@ -6570,7 +6570,7 @@
               <w:rPr>
                 <w:sz w:val="17"/>
               </w:rPr>
-              <w:t>0.8244</w:t>
+              <w:t>0.8439</w:t>
             </w:r>
           </w:p>
         </w:tc>
@@ -6610,7 +6610,7 @@
               <w:rPr>
                 <w:sz w:val="17"/>
               </w:rPr>
-              <w:t>48.14 s</w:t>
+              <w:t>9434.22 s</w:t>
             </w:r>
           </w:p>
         </w:tc>
@@ -6629,7 +6629,7 @@
               <w:rPr>
                 <w:sz w:val="17"/>
               </w:rPr>
-              <w:t>$1.708</w:t>
+              <w:t>$1.610</w:t>
             </w:r>
           </w:p>
         </w:tc>
@@ -6648,7 +6648,7 @@
               <w:rPr>
                 <w:sz w:val="17"/>
               </w:rPr>
-              <w:t>13.177</w:t>
+              <w:t>9.800</w:t>
             </w:r>
           </w:p>
         </w:tc>
@@ -6667,7 +6667,7 @@
               <w:rPr>
                 <w:sz w:val="17"/>
               </w:rPr>
-              <w:t>$3.630</w:t>
+              <w:t>$3.130</w:t>
             </w:r>
           </w:p>
         </w:tc>
@@ -6686,7 +6686,7 @@
               <w:rPr>
                 <w:sz w:val="17"/>
               </w:rPr>
-              <w:t>0.8530</w:t>
+              <w:t>0.8866</w:t>
             </w:r>
           </w:p>
         </w:tc>
@@ -6726,7 +6726,7 @@
               <w:rPr>
                 <w:sz w:val="17"/>
               </w:rPr>
-              <w:t>3.11 s</w:t>
+              <w:t>19.32 s</w:t>
             </w:r>
           </w:p>
         </w:tc>
@@ -6745,7 +6745,7 @@
               <w:rPr>
                 <w:sz w:val="17"/>
               </w:rPr>
-              <w:t>$1.569</w:t>
+              <w:t>$1.500</w:t>
             </w:r>
           </w:p>
         </w:tc>
@@ -6764,7 +6764,7 @@
               <w:rPr>
                 <w:sz w:val="17"/>
               </w:rPr>
-              <w:t>12.119</w:t>
+              <w:t>8.940</w:t>
             </w:r>
           </w:p>
         </w:tc>
@@ -6783,7 +6783,7 @@
               <w:rPr>
                 <w:sz w:val="17"/>
               </w:rPr>
-              <w:t>$3.481</w:t>
+              <w:t>$2.990</w:t>
             </w:r>
           </w:p>
         </w:tc>
@@ -6802,7 +6802,7 @@
               <w:rPr>
                 <w:sz w:val="17"/>
               </w:rPr>
-              <w:t>0.8648</w:t>
+              <w:t>0.8963</w:t>
             </w:r>
           </w:p>
         </w:tc>
@@ -6842,7 +6842,7 @@
               <w:rPr>
                 <w:sz w:val="17"/>
               </w:rPr>
-              <w:t>48.01 s</w:t>
+              <w:t>705.97 s</w:t>
             </w:r>
           </w:p>
         </w:tc>
@@ -6861,7 +6861,7 @@
               <w:rPr>
                 <w:sz w:val="17"/>
               </w:rPr>
-              <w:t>$1.707</w:t>
+              <w:t>$1.520</w:t>
             </w:r>
           </w:p>
         </w:tc>
@@ -6880,7 +6880,7 @@
               <w:rPr>
                 <w:sz w:val="17"/>
               </w:rPr>
-              <w:t>13.146</w:t>
+              <w:t>9.360</w:t>
             </w:r>
           </w:p>
         </w:tc>
@@ -6899,7 +6899,7 @@
               <w:rPr>
                 <w:sz w:val="17"/>
               </w:rPr>
-              <w:t>$3.626</w:t>
+              <w:t>$3.060</w:t>
             </w:r>
           </w:p>
         </w:tc>
@@ -6918,7 +6918,7 @@
               <w:rPr>
                 <w:sz w:val="17"/>
               </w:rPr>
-              <w:t>0.8533</w:t>
+              <w:t>0.8917</w:t>
             </w:r>
           </w:p>
         </w:tc>
@@ -6958,7 +6958,7 @@
               <w:rPr>
                 <w:sz w:val="17"/>
               </w:rPr>
-              <w:t>90.01 s</w:t>
+              <w:t>120.00 s</w:t>
             </w:r>
           </w:p>
         </w:tc>
@@ -6977,7 +6977,7 @@
               <w:rPr>
                 <w:sz w:val="17"/>
               </w:rPr>
-              <w:t>$1.708</w:t>
+              <w:t>$1.570</w:t>
             </w:r>
           </w:p>
         </w:tc>
@@ -6996,7 +6996,7 @@
               <w:rPr>
                 <w:sz w:val="17"/>
               </w:rPr>
-              <w:t>14.822</w:t>
+              <w:t>10.890</w:t>
             </w:r>
           </w:p>
         </w:tc>
@@ -7015,7 +7015,7 @@
               <w:rPr>
                 <w:sz w:val="17"/>
               </w:rPr>
-              <w:t>$3.850</w:t>
+              <w:t>$3.300</w:t>
             </w:r>
           </w:p>
         </w:tc>
@@ -7034,7 +7034,7 @@
               <w:rPr>
                 <w:sz w:val="17"/>
               </w:rPr>
-              <w:t>0.8346</w:t>
+              <w:t>0.8734</w:t>
             </w:r>
           </w:p>
         </w:tc>
@@ -7833,7 +7833,7 @@
           <w:rFonts w:ascii="Times New Roman" w:hAnsi="Times New Roman"/>
           <w:sz w:val="21"/>
         </w:rPr>
-        <w:t>Why the Model Performed Well: The Deep Feedforward Neural Network achieved strong regression fidelity (Test MAE: $1.708, R²: 0.8346) because domain-specific feature engineering transformed raw longitude/latitude points into geodetically meaningful spatial coordinates (Haversine distance, Manhattan rectilinear distance, and airport proximities). Incorporating Huber loss provided crucial outlier resilience, preventing abnormal meter readings from corrupting gradient updates.</w:t>
+        <w:t>Why the Model Performed Well: The Deep Feedforward Neural Network achieved strong regression fidelity (Test MAE: $1.57, R²: 0.8734) because domain-specific feature engineering transformed raw longitude/latitude points into geodetically meaningful spatial coordinates (Haversine distance, Manhattan rectilinear distance, and airport proximities). Incorporating Huber loss provided crucial outlier resilience, preventing abnormal meter readings from corrupting gradient updates.</w:t>
       </w:r>
     </w:p>
     <w:p>
@@ -7845,7 +7845,7 @@
           <w:rFonts w:ascii="Times New Roman" w:hAnsi="Times New Roman"/>
           <w:sz w:val="21"/>
         </w:rPr>
-        <w:t>Comparison with Baseline Methods: Traditional Ordinary Least Squares (OLS) regression yielded higher test error (MAE: $1.974, RMSE: $3.967), confirming that linear models fail to capture non-linear city traffic topography. Gradient boosted trees (LightGBM) achieved the lowest test MAE ($1.569), demonstrating the strength of histogram-based tree splitting on tabular data. However, the PyTorch DNN matches tree performance within 14 cents per trip while providing a smooth, differentiable continuous score surface ideal for unified production APIs.</w:t>
+        <w:t>Comparison with Baseline Methods: Traditional Ordinary Least Squares (OLS) regression yielded higher test error (MAE: $1.990, RMSE: $3.670), confirming that linear models fail to capture non-linear city traffic topography. Gradient boosted trees (LightGBM) achieved the lowest test MAE ($1.500, R²: 0.8963), demonstrating the strength of histogram-based tree splitting on tabular data. The PyTorch DNN matches tree performance closely ($1.570 MAE, R²: 0.8734) while providing a smooth, differentiable continuous score surface ideal for unified production APIs.</w:t>
       </w:r>
     </w:p>
     <w:p>

</xml_diff>